<commit_message>
feat: Enhance homepage by replacing static description with dynamic skill tags
</commit_message>
<xml_diff>
--- a/public/resume/Rajmohan_S_UI_Architect_MERN_Agentic_AI_16yrs.docx
+++ b/public/resume/Rajmohan_S_UI_Architect_MERN_Agentic_AI_16yrs.docx
@@ -2615,7 +2615,7 @@
                     </wp:inline>
                   </w:drawing>
                 </mc:Choice>
-                <mc:Fallback xmlns:sl="http://schemas.openxmlformats.org/schemaLibrary/2006/main" xmlns:a="http://schemas.openxmlformats.org/drawingml/2006/main" xmlns:pic="http://schemas.openxmlformats.org/drawingml/2006/picture" xmlns:c="http://schemas.openxmlformats.org/drawingml/2006/chart" xmlns:lc="http://schemas.openxmlformats.org/drawingml/2006/lockedCanvas" xmlns:dgm="http://schemas.openxmlformats.org/drawingml/2006/diagram">
+                <mc:Fallback xmlns:dgm="http://schemas.openxmlformats.org/drawingml/2006/diagram" xmlns:lc="http://schemas.openxmlformats.org/drawingml/2006/lockedCanvas" xmlns:c="http://schemas.openxmlformats.org/drawingml/2006/chart" xmlns:pic="http://schemas.openxmlformats.org/drawingml/2006/picture" xmlns:a="http://schemas.openxmlformats.org/drawingml/2006/main" xmlns:sl="http://schemas.openxmlformats.org/schemaLibrary/2006/main">
                   <w:drawing>
                     <wp:inline distB="0" distT="0" distL="0" distR="0">
                       <wp:extent cx="191021" cy="285750"/>
@@ -7849,7 +7849,7 @@
             <w:i/>
             <w:iCs/>
           </w:rPr>
-          <w:t>https://rajmohan.netlify.app/</w:t>
+          <w:t>https://rajmohan-s.netlify.app/</w:t>
         </w:r>
       </w:hyperlink>
       <w:r>
@@ -9120,6 +9120,18 @@
       <w:vertAlign w:val="superscript"/>
     </w:rPr>
   </w:style>
+  <w:style w:type="character" w:styleId="FollowedHyperlink">
+    <w:name w:val="FollowedHyperlink"/>
+    <w:basedOn w:val="DefaultParagraphFont"/>
+    <w:uiPriority w:val="99"/>
+    <w:semiHidden/>
+    <w:unhideWhenUsed/>
+    <w:rsid w:val="0050108F"/>
+    <w:rPr>
+      <w:color w:val="800080" w:themeColor="followedHyperlink"/>
+      <w:u w:val="single"/>
+    </w:rPr>
+  </w:style>
 </w:styles>
 </file>
 

</xml_diff>